<commit_message>
Nova: inventory demo (tool-use), persistent encrypted memory, hardened lookup, location + nearby places, feed-a-picture vision; wake/always-listen fixes; docs v0.4/TOGAF v1.2
</commit_message>
<xml_diff>
--- a/docs/Claudette_Spec.docx
+++ b/docs/Claudette_Spec.docx
@@ -63,7 +63,7 @@
           <w:sz w:val="20"/>
           <w:szCs w:val="20"/>
         </w:rPr>
-        <w:t xml:space="preserve">An always-on, hands-free voice companion for Android — wake word, a warm female voice, persistent memory, and a sense of humor.</w:t>
+        <w:t xml:space="preserve">An always-on, hands-free voice companion for Android — wake word, a warm female voice, persistent memory, location awareness, the ability to look at a photo you show her, and a sense of humor.</w:t>
       </w:r>
     </w:p>
     <w:p>
@@ -76,7 +76,7 @@
           <w:sz w:val="20"/>
           <w:szCs w:val="20"/>
         </w:rPr>
-        <w:t xml:space="preserve">Version 0.3  ·  Draft  ·  30 July 2026</w:t>
+        <w:t xml:space="preserve">Version 0.4  ·  Draft  ·  31 July 2026</w:t>
       </w:r>
     </w:p>
     <w:p>
@@ -178,7 +178,7 @@
         <w:spacing w:after="120"/>
       </w:pPr>
       <w:r>
-        <w:t xml:space="preserve">Two capabilities added since the first draft make her materially more than a voice front-end to a chatbot. First, she now has persistent, encrypted memory: she learns durable facts about John over time and carries them across sessions. Second, she can call tools during a conversation, which powers a store-inventory demonstration mode built to show a live, hands-free retail assistant to leadership.</w:t>
+        <w:t xml:space="preserve">Several capabilities added since the first draft make her materially more than a voice front-end to a chatbot. She now has persistent, encrypted memory, so she learns durable facts about John and carries them across sessions. She can call tools mid-conversation — powering a store-inventory demonstration mode built to pitch a hands-free retail assistant to leadership, plus on-demand location awareness and a nearby-places lookup. And she can see: John can hand her a photo from the app and she describes it and answers questions about it.</w:t>
       </w:r>
     </w:p>
     <w:p>
@@ -292,6 +292,32 @@
       </w:pPr>
       <w:r>
         <w:t xml:space="preserve">Call tools mid-conversation to answer from structured data (the inventory demonstration), with deterministic, verifiable results.</w:t>
+      </w:r>
+    </w:p>
+    <w:p>
+      <w:pPr>
+        <w:pStyle w:val="ListParagraph"/>
+        <w:numPr>
+          <w:ilvl w:val="0"/>
+          <w:numId w:val="1"/>
+        </w:numPr>
+        <w:spacing w:after="80"/>
+      </w:pPr>
+      <w:r>
+        <w:t xml:space="preserve">Know where John is, on demand, and answer questions about what is around him.</w:t>
+      </w:r>
+    </w:p>
+    <w:p>
+      <w:pPr>
+        <w:pStyle w:val="ListParagraph"/>
+        <w:numPr>
+          <w:ilvl w:val="0"/>
+          <w:numId w:val="1"/>
+        </w:numPr>
+        <w:spacing w:after="80"/>
+      </w:pPr>
+      <w:r>
+        <w:t xml:space="preserve">Let John hand her a photo from the app and tell him what it is.</w:t>
       </w:r>
     </w:p>
     <w:p>
@@ -1537,6 +1563,192 @@
           </w:p>
         </w:tc>
       </w:tr>
+      <w:tr>
+        <w:tc>
+          <w:tcPr>
+            <w:tcW w:type="dxa" w:w="900"/>
+            <w:tcMar>
+              <w:top w:type="dxa" w:w="60"/>
+              <w:left w:type="dxa" w:w="100"/>
+              <w:bottom w:type="dxa" w:w="60"/>
+              <w:right w:type="dxa" w:w="100"/>
+            </w:tcMar>
+          </w:tcPr>
+          <w:p>
+            <w:r>
+              <w:rPr>
+                <w:b w:val="false"/>
+                <w:bCs w:val="false"/>
+              </w:rPr>
+              <w:t xml:space="preserve">FR-18</w:t>
+            </w:r>
+          </w:p>
+        </w:tc>
+        <w:tc>
+          <w:tcPr>
+            <w:tcW w:type="dxa" w:w="7460"/>
+            <w:tcMar>
+              <w:top w:type="dxa" w:w="60"/>
+              <w:left w:type="dxa" w:w="100"/>
+              <w:bottom w:type="dxa" w:w="60"/>
+              <w:right w:type="dxa" w:w="100"/>
+            </w:tcMar>
+          </w:tcPr>
+          <w:p>
+            <w:r>
+              <w:rPr>
+                <w:b w:val="false"/>
+                <w:bCs w:val="false"/>
+              </w:rPr>
+              <w:t xml:space="preserve">Know John’s current location on demand (fresh fix, reverse-geocoded), used only when a question needs it.</w:t>
+            </w:r>
+          </w:p>
+        </w:tc>
+        <w:tc>
+          <w:tcPr>
+            <w:tcW w:type="dxa" w:w="1000"/>
+            <w:tcMar>
+              <w:top w:type="dxa" w:w="60"/>
+              <w:left w:type="dxa" w:w="100"/>
+              <w:bottom w:type="dxa" w:w="60"/>
+              <w:right w:type="dxa" w:w="100"/>
+            </w:tcMar>
+          </w:tcPr>
+          <w:p>
+            <w:r>
+              <w:rPr>
+                <w:b w:val="false"/>
+                <w:bCs w:val="false"/>
+              </w:rPr>
+              <w:t xml:space="preserve">Should</w:t>
+            </w:r>
+          </w:p>
+        </w:tc>
+      </w:tr>
+      <w:tr>
+        <w:tc>
+          <w:tcPr>
+            <w:tcW w:type="dxa" w:w="900"/>
+            <w:tcMar>
+              <w:top w:type="dxa" w:w="60"/>
+              <w:left w:type="dxa" w:w="100"/>
+              <w:bottom w:type="dxa" w:w="60"/>
+              <w:right w:type="dxa" w:w="100"/>
+            </w:tcMar>
+          </w:tcPr>
+          <w:p>
+            <w:r>
+              <w:rPr>
+                <w:b w:val="false"/>
+                <w:bCs w:val="false"/>
+              </w:rPr>
+              <w:t xml:space="preserve">FR-19</w:t>
+            </w:r>
+          </w:p>
+        </w:tc>
+        <w:tc>
+          <w:tcPr>
+            <w:tcW w:type="dxa" w:w="7460"/>
+            <w:tcMar>
+              <w:top w:type="dxa" w:w="60"/>
+              <w:left w:type="dxa" w:w="100"/>
+              <w:bottom w:type="dxa" w:w="60"/>
+              <w:right w:type="dxa" w:w="100"/>
+            </w:tcMar>
+          </w:tcPr>
+          <w:p>
+            <w:r>
+              <w:rPr>
+                <w:b w:val="false"/>
+                <w:bCs w:val="false"/>
+              </w:rPr>
+              <w:t xml:space="preserve">Answer “what’s around me / nearest X” via a nearby-places lookup (Google Places), nearest first.</w:t>
+            </w:r>
+          </w:p>
+        </w:tc>
+        <w:tc>
+          <w:tcPr>
+            <w:tcW w:type="dxa" w:w="1000"/>
+            <w:tcMar>
+              <w:top w:type="dxa" w:w="60"/>
+              <w:left w:type="dxa" w:w="100"/>
+              <w:bottom w:type="dxa" w:w="60"/>
+              <w:right w:type="dxa" w:w="100"/>
+            </w:tcMar>
+          </w:tcPr>
+          <w:p>
+            <w:r>
+              <w:rPr>
+                <w:b w:val="false"/>
+                <w:bCs w:val="false"/>
+              </w:rPr>
+              <w:t xml:space="preserve">Could</w:t>
+            </w:r>
+          </w:p>
+        </w:tc>
+      </w:tr>
+      <w:tr>
+        <w:tc>
+          <w:tcPr>
+            <w:tcW w:type="dxa" w:w="900"/>
+            <w:tcMar>
+              <w:top w:type="dxa" w:w="60"/>
+              <w:left w:type="dxa" w:w="100"/>
+              <w:bottom w:type="dxa" w:w="60"/>
+              <w:right w:type="dxa" w:w="100"/>
+            </w:tcMar>
+          </w:tcPr>
+          <w:p>
+            <w:r>
+              <w:rPr>
+                <w:b w:val="false"/>
+                <w:bCs w:val="false"/>
+              </w:rPr>
+              <w:t xml:space="preserve">FR-20</w:t>
+            </w:r>
+          </w:p>
+        </w:tc>
+        <w:tc>
+          <w:tcPr>
+            <w:tcW w:type="dxa" w:w="7460"/>
+            <w:tcMar>
+              <w:top w:type="dxa" w:w="60"/>
+              <w:left w:type="dxa" w:w="100"/>
+              <w:bottom w:type="dxa" w:w="60"/>
+              <w:right w:type="dxa" w:w="100"/>
+            </w:tcMar>
+          </w:tcPr>
+          <w:p>
+            <w:r>
+              <w:rPr>
+                <w:b w:val="false"/>
+                <w:bCs w:val="false"/>
+              </w:rPr>
+              <w:t xml:space="preserve">Let John feed Nova a photo (capture → confirm/retake/cancel), store it locally, and have her describe it and answer follow-ups in context.</w:t>
+            </w:r>
+          </w:p>
+        </w:tc>
+        <w:tc>
+          <w:tcPr>
+            <w:tcW w:type="dxa" w:w="1000"/>
+            <w:tcMar>
+              <w:top w:type="dxa" w:w="60"/>
+              <w:left w:type="dxa" w:w="100"/>
+              <w:bottom w:type="dxa" w:w="60"/>
+              <w:right w:type="dxa" w:w="100"/>
+            </w:tcMar>
+          </w:tcPr>
+          <w:p>
+            <w:r>
+              <w:rPr>
+                <w:b w:val="false"/>
+                <w:bCs w:val="false"/>
+              </w:rPr>
+              <w:t xml:space="preserve">Should</w:t>
+            </w:r>
+          </w:p>
+        </w:tc>
+      </w:tr>
     </w:tbl>
     <w:p>
       <w:pPr>
@@ -1557,7 +1769,7 @@
         <w:spacing w:after="120"/>
       </w:pPr>
       <w:r>
-        <w:t xml:space="preserve">Nova is a native Android application written in Kotlin and built in Android Studio. It is organized around a persistent foreground service that owns the audio pipeline and orchestrates several on-device and external capabilities: wake-word detection, speech-to-text, the language model (with tool use), text-to-speech, an encrypted memory store, and — for the demo — a local inventory query engine.</w:t>
+        <w:t xml:space="preserve">Nova is a native Android application written in Kotlin and built in Android Studio. It is organized around a persistent foreground service that owns the audio pipeline and orchestrates several on-device and external capabilities: wake-word detection, speech-to-text, the language model (with tool use), text-to-speech, an encrypted memory store, on-demand location and a nearby-places lookup, a vision path for photos John hands her, and — for the demo — a local inventory query engine.</w:t>
       </w:r>
     </w:p>
     <w:p>
@@ -2175,6 +2387,192 @@
                 <w:b w:val="false"/>
                 <w:bCs w:val="false"/>
               </w:rPr>
+              <w:t xml:space="preserve">Location</w:t>
+            </w:r>
+          </w:p>
+        </w:tc>
+        <w:tc>
+          <w:tcPr>
+            <w:tcW w:type="dxa" w:w="3200"/>
+            <w:tcMar>
+              <w:top w:type="dxa" w:w="60"/>
+              <w:left w:type="dxa" w:w="100"/>
+              <w:bottom w:type="dxa" w:w="60"/>
+              <w:right w:type="dxa" w:w="100"/>
+            </w:tcMar>
+          </w:tcPr>
+          <w:p>
+            <w:r>
+              <w:rPr>
+                <w:b w:val="false"/>
+                <w:bCs w:val="false"/>
+              </w:rPr>
+              <w:t xml:space="preserve">Fused location (Play Services) + Geocoder</w:t>
+            </w:r>
+          </w:p>
+        </w:tc>
+        <w:tc>
+          <w:tcPr>
+            <w:tcW w:type="dxa" w:w="4460"/>
+            <w:tcMar>
+              <w:top w:type="dxa" w:w="60"/>
+              <w:left w:type="dxa" w:w="100"/>
+              <w:bottom w:type="dxa" w:w="60"/>
+              <w:right w:type="dxa" w:w="100"/>
+            </w:tcMar>
+          </w:tcPr>
+          <w:p>
+            <w:r>
+              <w:rPr>
+                <w:b w:val="false"/>
+                <w:bCs w:val="false"/>
+              </w:rPr>
+              <w:t xml:space="preserve">On-demand fix, reverse-geocoded to a place; no continuous tracking (D13).</w:t>
+            </w:r>
+          </w:p>
+        </w:tc>
+      </w:tr>
+      <w:tr>
+        <w:tc>
+          <w:tcPr>
+            <w:tcW w:type="dxa" w:w="1700"/>
+            <w:tcMar>
+              <w:top w:type="dxa" w:w="60"/>
+              <w:left w:type="dxa" w:w="100"/>
+              <w:bottom w:type="dxa" w:w="60"/>
+              <w:right w:type="dxa" w:w="100"/>
+            </w:tcMar>
+          </w:tcPr>
+          <w:p>
+            <w:r>
+              <w:rPr>
+                <w:b w:val="false"/>
+                <w:bCs w:val="false"/>
+              </w:rPr>
+              <w:t xml:space="preserve">Nearby places</w:t>
+            </w:r>
+          </w:p>
+        </w:tc>
+        <w:tc>
+          <w:tcPr>
+            <w:tcW w:type="dxa" w:w="3200"/>
+            <w:tcMar>
+              <w:top w:type="dxa" w:w="60"/>
+              <w:left w:type="dxa" w:w="100"/>
+              <w:bottom w:type="dxa" w:w="60"/>
+              <w:right w:type="dxa" w:w="100"/>
+            </w:tcMar>
+          </w:tcPr>
+          <w:p>
+            <w:r>
+              <w:rPr>
+                <w:b w:val="false"/>
+                <w:bCs w:val="false"/>
+              </w:rPr>
+              <w:t xml:space="preserve">Google Places API (New)</w:t>
+            </w:r>
+          </w:p>
+        </w:tc>
+        <w:tc>
+          <w:tcPr>
+            <w:tcW w:type="dxa" w:w="4460"/>
+            <w:tcMar>
+              <w:top w:type="dxa" w:w="60"/>
+              <w:left w:type="dxa" w:w="100"/>
+              <w:bottom w:type="dxa" w:w="60"/>
+              <w:right w:type="dxa" w:w="100"/>
+            </w:tcMar>
+          </w:tcPr>
+          <w:p>
+            <w:r>
+              <w:rPr>
+                <w:b w:val="false"/>
+                <w:bCs w:val="false"/>
+              </w:rPr>
+              <w:t xml:space="preserve">Text Search biased to current location; uses the Google Maps key + billing.</w:t>
+            </w:r>
+          </w:p>
+        </w:tc>
+      </w:tr>
+      <w:tr>
+        <w:tc>
+          <w:tcPr>
+            <w:tcW w:type="dxa" w:w="1700"/>
+            <w:tcMar>
+              <w:top w:type="dxa" w:w="60"/>
+              <w:left w:type="dxa" w:w="100"/>
+              <w:bottom w:type="dxa" w:w="60"/>
+              <w:right w:type="dxa" w:w="100"/>
+            </w:tcMar>
+          </w:tcPr>
+          <w:p>
+            <w:r>
+              <w:rPr>
+                <w:b w:val="false"/>
+                <w:bCs w:val="false"/>
+              </w:rPr>
+              <w:t xml:space="preserve">Vision</w:t>
+            </w:r>
+          </w:p>
+        </w:tc>
+        <w:tc>
+          <w:tcPr>
+            <w:tcW w:type="dxa" w:w="3200"/>
+            <w:tcMar>
+              <w:top w:type="dxa" w:w="60"/>
+              <w:left w:type="dxa" w:w="100"/>
+              <w:bottom w:type="dxa" w:w="60"/>
+              <w:right w:type="dxa" w:w="100"/>
+            </w:tcMar>
+          </w:tcPr>
+          <w:p>
+            <w:r>
+              <w:rPr>
+                <w:b w:val="false"/>
+                <w:bCs w:val="false"/>
+              </w:rPr>
+              <w:t xml:space="preserve">Claude multimodal + system camera (FileProvider)</w:t>
+            </w:r>
+          </w:p>
+        </w:tc>
+        <w:tc>
+          <w:tcPr>
+            <w:tcW w:type="dxa" w:w="4460"/>
+            <w:tcMar>
+              <w:top w:type="dxa" w:w="60"/>
+              <w:left w:type="dxa" w:w="100"/>
+              <w:bottom w:type="dxa" w:w="60"/>
+              <w:right w:type="dxa" w:w="100"/>
+            </w:tcMar>
+          </w:tcPr>
+          <w:p>
+            <w:r>
+              <w:rPr>
+                <w:b w:val="false"/>
+                <w:bCs w:val="false"/>
+              </w:rPr>
+              <w:t xml:space="preserve">“Give Nova a Picture”: capture → confirm → analyze; no CAMERA permission needed.</w:t>
+            </w:r>
+          </w:p>
+        </w:tc>
+      </w:tr>
+      <w:tr>
+        <w:tc>
+          <w:tcPr>
+            <w:tcW w:type="dxa" w:w="1700"/>
+            <w:tcMar>
+              <w:top w:type="dxa" w:w="60"/>
+              <w:left w:type="dxa" w:w="100"/>
+              <w:bottom w:type="dxa" w:w="60"/>
+              <w:right w:type="dxa" w:w="100"/>
+            </w:tcMar>
+          </w:tcPr>
+          <w:p>
+            <w:r>
+              <w:rPr>
+                <w:b w:val="false"/>
+                <w:bCs w:val="false"/>
+              </w:rPr>
               <w:t xml:space="preserve">Secure storage</w:t>
             </w:r>
           </w:p>
@@ -2681,7 +3079,67 @@
           <w:bCs/>
           <w:color w:val="1F3864"/>
         </w:rPr>
-        <w:t xml:space="preserve">7. Model Routing</w:t>
+        <w:t xml:space="preserve">7. Location &amp; Nearby Places</w:t>
+      </w:r>
+    </w:p>
+    <w:p>
+      <w:pPr>
+        <w:spacing w:after="120"/>
+      </w:pPr>
+      <w:r>
+        <w:t xml:space="preserve">Nova knows where John is and can answer questions about what is around him (decision D13). Location is fetched on demand — a fresh fix only when a question needs one, never continuous tracking — which keeps battery use and privacy exposure low (threat S10). Coordinates are reverse-geocoded on-device to a human place name (address, city, area).</w:t>
+      </w:r>
+    </w:p>
+    <w:p>
+      <w:pPr>
+        <w:spacing w:after="120"/>
+      </w:pPr>
+      <w:r>
+        <w:t xml:space="preserve">Two tools back this. get_location returns John’s current position and place; nearby_places runs a Google Places (New) text search biased to that position and returns nearby matches — name, address, distance, rating, and open-now — nearest first, for questions like “what’s around me” or “nearest pharmacy.” The location layer is free and needs no key; the nearby-places lookup uses John’s Google Maps API key (Places API enabled, billing on). Nothing is persisted; location serves only the immediate query.</w:t>
+      </w:r>
+    </w:p>
+    <w:p>
+      <w:pPr>
+        <w:pStyle w:val="Heading1"/>
+        <w:spacing w:after="120" w:before="280"/>
+      </w:pPr>
+      <w:r>
+        <w:rPr>
+          <w:b/>
+          <w:bCs/>
+          <w:color w:val="1F3864"/>
+        </w:rPr>
+        <w:t xml:space="preserve">8. Vision — Showing Nova a Picture</w:t>
+      </w:r>
+    </w:p>
+    <w:p>
+      <w:pPr>
+        <w:spacing w:after="120"/>
+      </w:pPr>
+      <w:r>
+        <w:t xml:space="preserve">Rather than a battery-hungry always-on camera (which Android also restricts in the background), Nova sees on request (decision D22). A “Give Nova a Picture” button opens the camera; after the shot John gets a review screen with Confirm, Retake, and Cancel. On Confirm the photo is saved to Nova’s private on-device folder — staged for the future check-in backup (D18) — and handed to Nova.</w:t>
+      </w:r>
+    </w:p>
+    <w:p>
+      <w:pPr>
+        <w:spacing w:after="120"/>
+      </w:pPr>
+      <w:r>
+        <w:t xml:space="preserve">She analyzes the image once with Claude’s vision, says what it is, and her description folds into the ongoing conversation as text, so follow-up questions (“what’s the model number?”) keep context without re-sending the image. Capture uses the system camera through an intent, so no camera permission is required. The image leaves the device only at the moment of analysis; because raw photos are far heavier than text memory, when off-device backup (D18) is built we will decide whether it carries the images or only Nova’s notes about them — encrypted client-side first (threat S13).</w:t>
+      </w:r>
+    </w:p>
+    <w:p>
+      <w:pPr>
+        <w:pStyle w:val="Heading1"/>
+        <w:spacing w:after="120" w:before="280"/>
+      </w:pPr>
+      <w:r>
+        <w:rPr>
+          <w:b/>
+          <w:bCs/>
+          <w:color w:val="1F3864"/>
+        </w:rPr>
+        <w:t xml:space="preserve">9. Model Routing</w:t>
       </w:r>
     </w:p>
     <w:p>
@@ -2729,7 +3187,7 @@
           <w:bCs/>
           <w:color w:val="1F3864"/>
         </w:rPr>
-        <w:t xml:space="preserve">8. Android Permissions</w:t>
+        <w:t xml:space="preserve">10. Android Permissions</w:t>
       </w:r>
     </w:p>
     <w:tbl>
@@ -3066,6 +3524,90 @@
                 <w:b w:val="false"/>
                 <w:bCs w:val="false"/>
               </w:rPr>
+              <w:t xml:space="preserve">ACCESS_FINE_LOCATION / ACCESS_COARSE_LOCATION</w:t>
+            </w:r>
+          </w:p>
+        </w:tc>
+        <w:tc>
+          <w:tcPr>
+            <w:tcW w:type="dxa" w:w="6160"/>
+            <w:tcMar>
+              <w:top w:type="dxa" w:w="60"/>
+              <w:left w:type="dxa" w:w="100"/>
+              <w:bottom w:type="dxa" w:w="60"/>
+              <w:right w:type="dxa" w:w="100"/>
+            </w:tcMar>
+          </w:tcPr>
+          <w:p>
+            <w:r>
+              <w:rPr>
+                <w:b w:val="false"/>
+                <w:bCs w:val="false"/>
+              </w:rPr>
+              <w:t xml:space="preserve">On-demand location for “where am I” and nearby places (D13).</w:t>
+            </w:r>
+          </w:p>
+        </w:tc>
+      </w:tr>
+      <w:tr>
+        <w:tc>
+          <w:tcPr>
+            <w:tcW w:type="dxa" w:w="3200"/>
+            <w:tcMar>
+              <w:top w:type="dxa" w:w="60"/>
+              <w:left w:type="dxa" w:w="100"/>
+              <w:bottom w:type="dxa" w:w="60"/>
+              <w:right w:type="dxa" w:w="100"/>
+            </w:tcMar>
+          </w:tcPr>
+          <w:p>
+            <w:r>
+              <w:rPr>
+                <w:b w:val="false"/>
+                <w:bCs w:val="false"/>
+              </w:rPr>
+              <w:t xml:space="preserve">ACCESS_BACKGROUND_LOCATION</w:t>
+            </w:r>
+          </w:p>
+        </w:tc>
+        <w:tc>
+          <w:tcPr>
+            <w:tcW w:type="dxa" w:w="6160"/>
+            <w:tcMar>
+              <w:top w:type="dxa" w:w="60"/>
+              <w:left w:type="dxa" w:w="100"/>
+              <w:bottom w:type="dxa" w:w="60"/>
+              <w:right w:type="dxa" w:w="100"/>
+            </w:tcMar>
+          </w:tcPr>
+          <w:p>
+            <w:r>
+              <w:rPr>
+                <w:b w:val="false"/>
+                <w:bCs w:val="false"/>
+              </w:rPr>
+              <w:t xml:space="preserve">Answer location questions while running in the background (best-effort; “Allow all the time”).</w:t>
+            </w:r>
+          </w:p>
+        </w:tc>
+      </w:tr>
+      <w:tr>
+        <w:tc>
+          <w:tcPr>
+            <w:tcW w:type="dxa" w:w="3200"/>
+            <w:tcMar>
+              <w:top w:type="dxa" w:w="60"/>
+              <w:left w:type="dxa" w:w="100"/>
+              <w:bottom w:type="dxa" w:w="60"/>
+              <w:right w:type="dxa" w:w="100"/>
+            </w:tcMar>
+          </w:tcPr>
+          <w:p>
+            <w:r>
+              <w:rPr>
+                <w:b w:val="false"/>
+                <w:bCs w:val="false"/>
+              </w:rPr>
               <w:t xml:space="preserve">RECEIVE_BOOT_COMPLETED</w:t>
             </w:r>
           </w:p>
@@ -3092,6 +3634,14 @@
         </w:tc>
       </w:tr>
     </w:tbl>
+    <w:p>
+      <w:pPr>
+        <w:spacing w:after="120"/>
+      </w:pPr>
+      <w:r>
+        <w:t xml:space="preserve">Taking a photo uses the system camera through an intent, so Nova needs no CAMERA permission of her own.</w:t>
+      </w:r>
+    </w:p>
     <w:p>
       <w:pPr>
         <w:pStyle w:val="Heading1"/>
@@ -3103,7 +3653,7 @@
           <w:bCs/>
           <w:color w:val="1F3864"/>
         </w:rPr>
-        <w:t xml:space="preserve">9. Security &amp; Privacy</w:t>
+        <w:t xml:space="preserve">11. Security &amp; Privacy</w:t>
       </w:r>
     </w:p>
     <w:p>
@@ -4000,7 +4550,7 @@
                 <w:b w:val="false"/>
                 <w:bCs w:val="false"/>
               </w:rPr>
-              <w:t xml:space="preserve">Location awareness (planned, D13) exposes sensitive location PII.</w:t>
+              <w:t xml:space="preserve">Location awareness (D13, implemented) exposes sensitive location PII.</w:t>
             </w:r>
           </w:p>
         </w:tc>
@@ -4040,7 +4590,7 @@
                 <w:b w:val="false"/>
                 <w:bCs w:val="false"/>
               </w:rPr>
-              <w:t xml:space="preserve">On-device, on-demand only; never persisted or sent beyond the immediate query; user can disable.</w:t>
+              <w:t xml:space="preserve">On-device, on-demand only (no continuous tracking); never persisted or sent beyond the immediate query; user can disable.</w:t>
             </w:r>
           </w:p>
         </w:tc>
@@ -4287,6 +4837,252 @@
                 <w:bCs w:val="false"/>
               </w:rPr>
               <w:t xml:space="preserve">Mandatory client-side encryption before upload; private store only; guard the write credential.</w:t>
+            </w:r>
+          </w:p>
+        </w:tc>
+      </w:tr>
+      <w:tr>
+        <w:tc>
+          <w:tcPr>
+            <w:tcW w:type="dxa" w:w="700"/>
+            <w:tcMar>
+              <w:top w:type="dxa" w:w="60"/>
+              <w:left w:type="dxa" w:w="100"/>
+              <w:bottom w:type="dxa" w:w="60"/>
+              <w:right w:type="dxa" w:w="100"/>
+            </w:tcMar>
+          </w:tcPr>
+          <w:p>
+            <w:r>
+              <w:rPr>
+                <w:b w:val="false"/>
+                <w:bCs w:val="false"/>
+              </w:rPr>
+              <w:t xml:space="preserve">S14</w:t>
+            </w:r>
+          </w:p>
+        </w:tc>
+        <w:tc>
+          <w:tcPr>
+            <w:tcW w:type="dxa" w:w="4360"/>
+            <w:tcMar>
+              <w:top w:type="dxa" w:w="60"/>
+              <w:left w:type="dxa" w:w="100"/>
+              <w:bottom w:type="dxa" w:w="60"/>
+              <w:right w:type="dxa" w:w="100"/>
+            </w:tcMar>
+          </w:tcPr>
+          <w:p>
+            <w:r>
+              <w:rPr>
+                <w:b w:val="false"/>
+                <w:bCs w:val="false"/>
+              </w:rPr>
+              <w:t xml:space="preserve">Photos John feeds Nova are stored on-device and sent to Claude for analysis (D22).</w:t>
+            </w:r>
+          </w:p>
+        </w:tc>
+        <w:tc>
+          <w:tcPr>
+            <w:tcW w:type="dxa" w:w="800"/>
+            <w:tcMar>
+              <w:top w:type="dxa" w:w="60"/>
+              <w:left w:type="dxa" w:w="100"/>
+              <w:bottom w:type="dxa" w:w="60"/>
+              <w:right w:type="dxa" w:w="100"/>
+            </w:tcMar>
+          </w:tcPr>
+          <w:p>
+            <w:r>
+              <w:rPr>
+                <w:b w:val="false"/>
+                <w:bCs w:val="false"/>
+              </w:rPr>
+              <w:t xml:space="preserve">Med</w:t>
+            </w:r>
+          </w:p>
+        </w:tc>
+        <w:tc>
+          <w:tcPr>
+            <w:tcW w:type="dxa" w:w="3500"/>
+            <w:tcMar>
+              <w:top w:type="dxa" w:w="60"/>
+              <w:left w:type="dxa" w:w="100"/>
+              <w:bottom w:type="dxa" w:w="60"/>
+              <w:right w:type="dxa" w:w="100"/>
+            </w:tcMar>
+          </w:tcPr>
+          <w:p>
+            <w:r>
+              <w:rPr>
+                <w:b w:val="false"/>
+                <w:bCs w:val="false"/>
+              </w:rPr>
+              <w:t xml:space="preserve">Sandboxed app-internal storage; image sent only at analysis time; encrypt before any off-device backup (S13).</w:t>
+            </w:r>
+          </w:p>
+        </w:tc>
+      </w:tr>
+      <w:tr>
+        <w:tc>
+          <w:tcPr>
+            <w:tcW w:type="dxa" w:w="700"/>
+            <w:tcMar>
+              <w:top w:type="dxa" w:w="60"/>
+              <w:left w:type="dxa" w:w="100"/>
+              <w:bottom w:type="dxa" w:w="60"/>
+              <w:right w:type="dxa" w:w="100"/>
+            </w:tcMar>
+          </w:tcPr>
+          <w:p>
+            <w:r>
+              <w:rPr>
+                <w:b w:val="false"/>
+                <w:bCs w:val="false"/>
+              </w:rPr>
+              <w:t xml:space="preserve">S15</w:t>
+            </w:r>
+          </w:p>
+        </w:tc>
+        <w:tc>
+          <w:tcPr>
+            <w:tcW w:type="dxa" w:w="4360"/>
+            <w:tcMar>
+              <w:top w:type="dxa" w:w="60"/>
+              <w:left w:type="dxa" w:w="100"/>
+              <w:bottom w:type="dxa" w:w="60"/>
+              <w:right w:type="dxa" w:w="100"/>
+            </w:tcMar>
+          </w:tcPr>
+          <w:p>
+            <w:r>
+              <w:rPr>
+                <w:b w:val="false"/>
+                <w:bCs w:val="false"/>
+              </w:rPr>
+              <w:t xml:space="preserve">M365 / Teams / Outlook integration (parked, D20) would route work communications through a personal app.</w:t>
+            </w:r>
+          </w:p>
+        </w:tc>
+        <w:tc>
+          <w:tcPr>
+            <w:tcW w:type="dxa" w:w="800"/>
+            <w:tcMar>
+              <w:top w:type="dxa" w:w="60"/>
+              <w:left w:type="dxa" w:w="100"/>
+              <w:bottom w:type="dxa" w:w="60"/>
+              <w:right w:type="dxa" w:w="100"/>
+            </w:tcMar>
+          </w:tcPr>
+          <w:p>
+            <w:r>
+              <w:rPr>
+                <w:b w:val="false"/>
+                <w:bCs w:val="false"/>
+              </w:rPr>
+              <w:t xml:space="preserve">High</w:t>
+            </w:r>
+          </w:p>
+        </w:tc>
+        <w:tc>
+          <w:tcPr>
+            <w:tcW w:type="dxa" w:w="3500"/>
+            <w:tcMar>
+              <w:top w:type="dxa" w:w="60"/>
+              <w:left w:type="dxa" w:w="100"/>
+              <w:bottom w:type="dxa" w:w="60"/>
+              <w:right w:type="dxa" w:w="100"/>
+            </w:tcMar>
+          </w:tcPr>
+          <w:p>
+            <w:r>
+              <w:rPr>
+                <w:b w:val="false"/>
+                <w:bCs w:val="false"/>
+              </w:rPr>
+              <w:t xml:space="preserve">Do not build until employer/IT approval; OAuth + admin consent + revocable tokens only, never passwords.</w:t>
+            </w:r>
+          </w:p>
+        </w:tc>
+      </w:tr>
+      <w:tr>
+        <w:tc>
+          <w:tcPr>
+            <w:tcW w:type="dxa" w:w="700"/>
+            <w:tcMar>
+              <w:top w:type="dxa" w:w="60"/>
+              <w:left w:type="dxa" w:w="100"/>
+              <w:bottom w:type="dxa" w:w="60"/>
+              <w:right w:type="dxa" w:w="100"/>
+            </w:tcMar>
+          </w:tcPr>
+          <w:p>
+            <w:r>
+              <w:rPr>
+                <w:b w:val="false"/>
+                <w:bCs w:val="false"/>
+              </w:rPr>
+              <w:t xml:space="preserve">S16</w:t>
+            </w:r>
+          </w:p>
+        </w:tc>
+        <w:tc>
+          <w:tcPr>
+            <w:tcW w:type="dxa" w:w="4360"/>
+            <w:tcMar>
+              <w:top w:type="dxa" w:w="60"/>
+              <w:left w:type="dxa" w:w="100"/>
+              <w:bottom w:type="dxa" w:w="60"/>
+              <w:right w:type="dxa" w:w="100"/>
+            </w:tcMar>
+          </w:tcPr>
+          <w:p>
+            <w:r>
+              <w:rPr>
+                <w:b w:val="false"/>
+                <w:bCs w:val="false"/>
+              </w:rPr>
+              <w:t xml:space="preserve">Bank / expense access (parked, D21) — the most sensitive data category.</w:t>
+            </w:r>
+          </w:p>
+        </w:tc>
+        <w:tc>
+          <w:tcPr>
+            <w:tcW w:type="dxa" w:w="800"/>
+            <w:tcMar>
+              <w:top w:type="dxa" w:w="60"/>
+              <w:left w:type="dxa" w:w="100"/>
+              <w:bottom w:type="dxa" w:w="60"/>
+              <w:right w:type="dxa" w:w="100"/>
+            </w:tcMar>
+          </w:tcPr>
+          <w:p>
+            <w:r>
+              <w:rPr>
+                <w:b w:val="false"/>
+                <w:bCs w:val="false"/>
+              </w:rPr>
+              <w:t xml:space="preserve">High</w:t>
+            </w:r>
+          </w:p>
+        </w:tc>
+        <w:tc>
+          <w:tcPr>
+            <w:tcW w:type="dxa" w:w="3500"/>
+            <w:tcMar>
+              <w:top w:type="dxa" w:w="60"/>
+              <w:left w:type="dxa" w:w="100"/>
+              <w:bottom w:type="dxa" w:w="60"/>
+              <w:right w:type="dxa" w:w="100"/>
+            </w:tcMar>
+          </w:tcPr>
+          <w:p>
+            <w:r>
+              <w:rPr>
+                <w:b w:val="false"/>
+                <w:bCs w:val="false"/>
+              </w:rPr>
+              <w:t xml:space="preserve">Read-only, encrypted at rest, no money movement; prefer on-device export over an aggregator.</w:t>
             </w:r>
           </w:p>
         </w:tc>
@@ -4303,7 +5099,7 @@
           <w:bCs/>
           <w:color w:val="1F3864"/>
         </w:rPr>
-        <w:t xml:space="preserve">10. Build &amp; Delivery</w:t>
+        <w:t xml:space="preserve">12. Build &amp; Delivery</w:t>
       </w:r>
     </w:p>
     <w:p>
@@ -4369,7 +5165,7 @@
           <w:bCs/>
           <w:color w:val="1F3864"/>
         </w:rPr>
-        <w:t xml:space="preserve">11. Roadmap</w:t>
+        <w:t xml:space="preserve">13. Roadmap</w:t>
       </w:r>
     </w:p>
     <w:tbl>
@@ -4849,6 +5645,68 @@
                 <w:b w:val="false"/>
                 <w:bCs w:val="false"/>
               </w:rPr>
+              <w:t xml:space="preserve">Phase 4b</w:t>
+            </w:r>
+          </w:p>
+        </w:tc>
+        <w:tc>
+          <w:tcPr>
+            <w:tcW w:type="dxa" w:w="3000"/>
+            <w:tcMar>
+              <w:top w:type="dxa" w:w="60"/>
+              <w:left w:type="dxa" w:w="100"/>
+              <w:bottom w:type="dxa" w:w="60"/>
+              <w:right w:type="dxa" w:w="100"/>
+            </w:tcMar>
+          </w:tcPr>
+          <w:p>
+            <w:r>
+              <w:rPr>
+                <w:b w:val="false"/>
+                <w:bCs w:val="false"/>
+              </w:rPr>
+              <w:t xml:space="preserve">Perception</w:t>
+            </w:r>
+          </w:p>
+        </w:tc>
+        <w:tc>
+          <w:tcPr>
+            <w:tcW w:type="dxa" w:w="4860"/>
+            <w:tcMar>
+              <w:top w:type="dxa" w:w="60"/>
+              <w:left w:type="dxa" w:w="100"/>
+              <w:bottom w:type="dxa" w:w="60"/>
+              <w:right w:type="dxa" w:w="100"/>
+            </w:tcMar>
+          </w:tcPr>
+          <w:p>
+            <w:r>
+              <w:rPr>
+                <w:b w:val="false"/>
+                <w:bCs w:val="false"/>
+              </w:rPr>
+              <w:t xml:space="preserve">Done — location + nearby places (D13); feed-a-picture vision (D22).</w:t>
+            </w:r>
+          </w:p>
+        </w:tc>
+      </w:tr>
+      <w:tr>
+        <w:tc>
+          <w:tcPr>
+            <w:tcW w:type="dxa" w:w="1500"/>
+            <w:tcMar>
+              <w:top w:type="dxa" w:w="60"/>
+              <w:left w:type="dxa" w:w="100"/>
+              <w:bottom w:type="dxa" w:w="60"/>
+              <w:right w:type="dxa" w:w="100"/>
+            </w:tcMar>
+          </w:tcPr>
+          <w:p>
+            <w:r>
+              <w:rPr>
+                <w:b w:val="false"/>
+                <w:bCs w:val="false"/>
+              </w:rPr>
               <w:t xml:space="preserve">Phase 5</w:t>
             </w:r>
           </w:p>
@@ -4869,7 +5727,7 @@
                 <w:b w:val="false"/>
                 <w:bCs w:val="false"/>
               </w:rPr>
-              <w:t xml:space="preserve">Capabilities &amp; polish</w:t>
+              <w:t xml:space="preserve">Capabilities</w:t>
             </w:r>
           </w:p>
         </w:tc>
@@ -4889,7 +5747,69 @@
                 <w:b w:val="false"/>
                 <w:bCs w:val="false"/>
               </w:rPr>
-              <w:t xml:space="preserve">Planned — location (D13), web search (D14), off-device backup (D18), full “Nova” rename (D19), streaming, push-to-talk, final APK.</w:t>
+              <w:t xml:space="preserve">Planned — web search (D14), off-device backup (D18), streaming, push-to-talk.</w:t>
+            </w:r>
+          </w:p>
+        </w:tc>
+      </w:tr>
+      <w:tr>
+        <w:tc>
+          <w:tcPr>
+            <w:tcW w:type="dxa" w:w="1500"/>
+            <w:tcMar>
+              <w:top w:type="dxa" w:w="60"/>
+              <w:left w:type="dxa" w:w="100"/>
+              <w:bottom w:type="dxa" w:w="60"/>
+              <w:right w:type="dxa" w:w="100"/>
+            </w:tcMar>
+          </w:tcPr>
+          <w:p>
+            <w:r>
+              <w:rPr>
+                <w:b w:val="false"/>
+                <w:bCs w:val="false"/>
+              </w:rPr>
+              <w:t xml:space="preserve">Phase 6</w:t>
+            </w:r>
+          </w:p>
+        </w:tc>
+        <w:tc>
+          <w:tcPr>
+            <w:tcW w:type="dxa" w:w="3000"/>
+            <w:tcMar>
+              <w:top w:type="dxa" w:w="60"/>
+              <w:left w:type="dxa" w:w="100"/>
+              <w:bottom w:type="dxa" w:w="60"/>
+              <w:right w:type="dxa" w:w="100"/>
+            </w:tcMar>
+          </w:tcPr>
+          <w:p>
+            <w:r>
+              <w:rPr>
+                <w:b w:val="false"/>
+                <w:bCs w:val="false"/>
+              </w:rPr>
+              <w:t xml:space="preserve">Rename &amp; release</w:t>
+            </w:r>
+          </w:p>
+        </w:tc>
+        <w:tc>
+          <w:tcPr>
+            <w:tcW w:type="dxa" w:w="4860"/>
+            <w:tcMar>
+              <w:top w:type="dxa" w:w="60"/>
+              <w:left w:type="dxa" w:w="100"/>
+              <w:bottom w:type="dxa" w:w="60"/>
+              <w:right w:type="dxa" w:w="100"/>
+            </w:tcMar>
+          </w:tcPr>
+          <w:p>
+            <w:r>
+              <w:rPr>
+                <w:b w:val="false"/>
+                <w:bCs w:val="false"/>
+              </w:rPr>
+              <w:t xml:space="preserve">Planned — full “Nova” rename (D19), final APK. Parked pending approval: M365 (D20), bank/expense (D21).</w:t>
             </w:r>
           </w:p>
         </w:tc>

</xml_diff>

<commit_message>
Docs: Spec v0.5 + TOGAF v1.3 — demo photo intelligence, real MFCS 6-store data, memory/continuity, web search disabled
</commit_message>
<xml_diff>
--- a/docs/Claudette_Spec.docx
+++ b/docs/Claudette_Spec.docx
@@ -76,7 +76,7 @@
           <w:sz w:val="20"/>
           <w:szCs w:val="20"/>
         </w:rPr>
-        <w:t xml:space="preserve">Version 0.4  ·  Draft  ·  31 July 2026</w:t>
+        <w:t xml:space="preserve">Version 0.5  ·  Draft  ·  5 August 2026</w:t>
       </w:r>
     </w:p>
     <w:p>
@@ -178,7 +178,7 @@
         <w:spacing w:after="120"/>
       </w:pPr>
       <w:r>
-        <w:t xml:space="preserve">Several capabilities added since the first draft make her materially more than a voice front-end to a chatbot. She now has persistent, encrypted memory, so she learns durable facts about John and carries them across sessions. She can call tools mid-conversation — powering a store-inventory demonstration mode built to pitch a hands-free retail assistant to leadership, plus on-demand location awareness and a nearby-places lookup. And she can see: John can hand her a photo from the app and she describes it and answers questions about it.</w:t>
+        <w:t xml:space="preserve">Several capabilities added since the first draft make her materially more than a voice front-end to a chatbot. She now has persistent, encrypted memory, so she learns durable facts about John and carries them across sessions. She can call tools mid-conversation — powering a store-inventory demonstration mode built to pitch a hands-free retail assistant to leadership, plus on-demand location awareness and a nearby-places lookup. And she can see: John can hand her a photo from the app and she describes it and answers questions about it. In the store demonstration a photo is treated instead as an item to identify and match against inventory, and an on-screen indicator shows when demo mode is live and the shoe database is ready. A photo is folded into the live conversation — the microphone reopens so John can respond by voice, and one can even be handed to her mid-conversation — and her short-term memory now survives switching the microphone off and back on within a session.</w:t>
       </w:r>
     </w:p>
     <w:p>
@@ -383,7 +383,7 @@
         <w:spacing w:after="80"/>
       </w:pPr>
       <w:r>
-        <w:t xml:space="preserve">A production inventory backend — the demonstration uses a bundled synthetic dataset, not a live API or MCP service (see Section 6).</w:t>
+        <w:t xml:space="preserve">A production inventory backend — the demonstration uses a bundled dataset (a static snapshot derived from real MFCS inventory), not a live API or MCP service (see Section 6).</w:t>
       </w:r>
     </w:p>
     <w:p>
@@ -1749,6 +1749,192 @@
           </w:p>
         </w:tc>
       </w:tr>
+      <w:tr>
+        <w:tc>
+          <w:tcPr>
+            <w:tcW w:type="dxa" w:w="900"/>
+            <w:tcMar>
+              <w:top w:type="dxa" w:w="60"/>
+              <w:left w:type="dxa" w:w="100"/>
+              <w:bottom w:type="dxa" w:w="60"/>
+              <w:right w:type="dxa" w:w="100"/>
+            </w:tcMar>
+          </w:tcPr>
+          <w:p>
+            <w:r>
+              <w:rPr>
+                <w:b w:val="false"/>
+                <w:bCs w:val="false"/>
+              </w:rPr>
+              <w:t xml:space="preserve">FR-21</w:t>
+            </w:r>
+          </w:p>
+        </w:tc>
+        <w:tc>
+          <w:tcPr>
+            <w:tcW w:type="dxa" w:w="7460"/>
+            <w:tcMar>
+              <w:top w:type="dxa" w:w="60"/>
+              <w:left w:type="dxa" w:w="100"/>
+              <w:bottom w:type="dxa" w:w="60"/>
+              <w:right w:type="dxa" w:w="100"/>
+            </w:tcMar>
+          </w:tcPr>
+          <w:p>
+            <w:r>
+              <w:rPr>
+                <w:b w:val="false"/>
+                <w:bCs w:val="false"/>
+              </w:rPr>
+              <w:t xml:space="preserve">In demonstration mode, treat any photo as an item to identify (brand, model, colorway) and match against inventory, and respond as a complimentary sales associate — never remarking on wear or anything unflattering.</w:t>
+            </w:r>
+          </w:p>
+        </w:tc>
+        <w:tc>
+          <w:tcPr>
+            <w:tcW w:type="dxa" w:w="1000"/>
+            <w:tcMar>
+              <w:top w:type="dxa" w:w="60"/>
+              <w:left w:type="dxa" w:w="100"/>
+              <w:bottom w:type="dxa" w:w="60"/>
+              <w:right w:type="dxa" w:w="100"/>
+            </w:tcMar>
+          </w:tcPr>
+          <w:p>
+            <w:r>
+              <w:rPr>
+                <w:b w:val="false"/>
+                <w:bCs w:val="false"/>
+              </w:rPr>
+              <w:t xml:space="preserve">Should</w:t>
+            </w:r>
+          </w:p>
+        </w:tc>
+      </w:tr>
+      <w:tr>
+        <w:tc>
+          <w:tcPr>
+            <w:tcW w:type="dxa" w:w="900"/>
+            <w:tcMar>
+              <w:top w:type="dxa" w:w="60"/>
+              <w:left w:type="dxa" w:w="100"/>
+              <w:bottom w:type="dxa" w:w="60"/>
+              <w:right w:type="dxa" w:w="100"/>
+            </w:tcMar>
+          </w:tcPr>
+          <w:p>
+            <w:r>
+              <w:rPr>
+                <w:b w:val="false"/>
+                <w:bCs w:val="false"/>
+              </w:rPr>
+              <w:t xml:space="preserve">FR-22</w:t>
+            </w:r>
+          </w:p>
+        </w:tc>
+        <w:tc>
+          <w:tcPr>
+            <w:tcW w:type="dxa" w:w="7460"/>
+            <w:tcMar>
+              <w:top w:type="dxa" w:w="60"/>
+              <w:left w:type="dxa" w:w="100"/>
+              <w:bottom w:type="dxa" w:w="60"/>
+              <w:right w:type="dxa" w:w="100"/>
+            </w:tcMar>
+          </w:tcPr>
+          <w:p>
+            <w:r>
+              <w:rPr>
+                <w:b w:val="false"/>
+                <w:bCs w:val="false"/>
+              </w:rPr>
+              <w:t xml:space="preserve">Show an on-screen demonstration-mode indicator: whether demo mode is active, whether the shoe database has loaded, and when a photo is being analyzed.</w:t>
+            </w:r>
+          </w:p>
+        </w:tc>
+        <w:tc>
+          <w:tcPr>
+            <w:tcW w:type="dxa" w:w="1000"/>
+            <w:tcMar>
+              <w:top w:type="dxa" w:w="60"/>
+              <w:left w:type="dxa" w:w="100"/>
+              <w:bottom w:type="dxa" w:w="60"/>
+              <w:right w:type="dxa" w:w="100"/>
+            </w:tcMar>
+          </w:tcPr>
+          <w:p>
+            <w:r>
+              <w:rPr>
+                <w:b w:val="false"/>
+                <w:bCs w:val="false"/>
+              </w:rPr>
+              <w:t xml:space="preserve">Should</w:t>
+            </w:r>
+          </w:p>
+        </w:tc>
+      </w:tr>
+      <w:tr>
+        <w:tc>
+          <w:tcPr>
+            <w:tcW w:type="dxa" w:w="900"/>
+            <w:tcMar>
+              <w:top w:type="dxa" w:w="60"/>
+              <w:left w:type="dxa" w:w="100"/>
+              <w:bottom w:type="dxa" w:w="60"/>
+              <w:right w:type="dxa" w:w="100"/>
+            </w:tcMar>
+          </w:tcPr>
+          <w:p>
+            <w:r>
+              <w:rPr>
+                <w:b w:val="false"/>
+                <w:bCs w:val="false"/>
+              </w:rPr>
+              <w:t xml:space="preserve">FR-23</w:t>
+            </w:r>
+          </w:p>
+        </w:tc>
+        <w:tc>
+          <w:tcPr>
+            <w:tcW w:type="dxa" w:w="7460"/>
+            <w:tcMar>
+              <w:top w:type="dxa" w:w="60"/>
+              <w:left w:type="dxa" w:w="100"/>
+              <w:bottom w:type="dxa" w:w="60"/>
+              <w:right w:type="dxa" w:w="100"/>
+            </w:tcMar>
+          </w:tcPr>
+          <w:p>
+            <w:r>
+              <w:rPr>
+                <w:b w:val="false"/>
+                <w:bCs w:val="false"/>
+              </w:rPr>
+              <w:t xml:space="preserve">Fold a photo into the live conversation (reopen the mic for a spoken reply; accept a photo handed in mid-conversation) and retain short-term memory across a microphone off/on within a session.</w:t>
+            </w:r>
+          </w:p>
+        </w:tc>
+        <w:tc>
+          <w:tcPr>
+            <w:tcW w:type="dxa" w:w="1000"/>
+            <w:tcMar>
+              <w:top w:type="dxa" w:w="60"/>
+              <w:left w:type="dxa" w:w="100"/>
+              <w:bottom w:type="dxa" w:w="60"/>
+              <w:right w:type="dxa" w:w="100"/>
+            </w:tcMar>
+          </w:tcPr>
+          <w:p>
+            <w:r>
+              <w:rPr>
+                <w:b w:val="false"/>
+                <w:bCs w:val="false"/>
+              </w:rPr>
+              <w:t xml:space="preserve">Should</w:t>
+            </w:r>
+          </w:p>
+        </w:tc>
+      </w:tr>
     </w:tbl>
     <w:p>
       <w:pPr>
@@ -2365,7 +2551,7 @@
                 <w:b w:val="false"/>
                 <w:bCs w:val="false"/>
               </w:rPr>
-              <w:t xml:space="preserve">Synthetic 4-store inventory; deterministic filtering behind Claude tools.</w:t>
+              <w:t xml:space="preserve">Bundled 6-store dataset derived from real Oracle MFCS (PRD1) footwear inventory; deterministic filtering behind Claude tools.</w:t>
             </w:r>
           </w:p>
         </w:tc>
@@ -2995,7 +3181,7 @@
         <w:spacing w:after="120"/>
       </w:pPr>
       <w:r>
-        <w:t xml:space="preserve">Nova remembers John across sessions (decisions D12 and D16). Two forms of memory work together. Short-term working memory holds the last several turns in RAM during a conversation and resets after a few minutes of silence. Long-term memory is persistent: a compact profile of durable facts (his work, projects, the people in his life, his preferences and values) plus a short rolling summary of what has recently been going on.</w:t>
+        <w:t xml:space="preserve">Nova remembers John across sessions (decisions D12 and D16). Two forms of memory work together. Short-term working memory holds the last several turns in RAM during a conversation. It is held at the process level, so it survives switching the microphone off and back on within an app run, and resets after about thirty minutes of silence (raised from five so a demo or a paused chat is not forgotten mid-stream); it is still lost if the operating system kills the app process, so durable on-disk persistence remains a future option. Long-term memory is persistent: a compact profile of durable facts (his work, projects, the people in his life, his preferences and values) plus a short rolling summary of what has recently been going on.</w:t>
       </w:r>
     </w:p>
     <w:p>
@@ -3041,7 +3227,7 @@
         <w:spacing w:after="120"/>
       </w:pPr>
       <w:r>
-        <w:t xml:space="preserve">Approach (decision: Option 2). Nova answers by calling on-device tools over a bundled copy of a synthetic four-store inventory dataset, rather than by reasoning over raw rows. This is deliberately a demonstration shortcut, not a scalable design — the goal is to show the end-user experience convincingly. The three tools are check_stock (availability by identifier or loose description, with per-store counts and the 0146 back-room shelf location), store_rollup (unit totals across stores, filterable by brand / category / gender), and pricing_lookup (price and lifecycle, including clearance). Every count and location is computed deterministically in Kotlin, so answers are exact.</w:t>
+        <w:t xml:space="preserve">Approach (decision: Option 2). Nova answers by calling on-device tools over a bundled dataset derived from real Oracle MFCS (PRD1) footwear inventory across six stores, rather than by reasoning over raw rows. This is deliberately a demonstration shortcut, not a scalable design — the goal is to show the end-user experience convincingly. The three tools are check_stock (availability by identifier or loose description, with per-store counts and the home-store back-room shelf location), store_rollup (unit totals across stores, filterable by brand / category / gender), and pricing_lookup (price and lifecycle, including clearance). Every count and location is computed deterministically in Kotlin, so answers are exact.</w:t>
       </w:r>
     </w:p>
     <w:p>
@@ -3049,7 +3235,7 @@
         <w:spacing w:after="120"/>
       </w:pPr>
       <w:r>
-        <w:t xml:space="preserve">Store context. The home store is 0146, Trussville Marketplace (a Hibbett Sports location); the other three — Cartersville, Southaven, and Florence — are treated as nearby stores. When an item is in stock at 0146, Nova gives its exact back-room location (zone, bay, shelf, bin, and reach height). When it is not at 0146 but a nearby store has it, she names the store and offers to hold a pair. A pre-computed stock summary and a firm rule prevent false out-of-stock calls: she never reports an item unavailable unless every size and store confirms it.</w:t>
+        <w:t xml:space="preserve">Store context. The home store is 1511, the Homewood (Wildwood) Hibbett Sports in Homewood, Alabama; four nearby Birmingham-area stores — 33 Western Hills, 54 Sports Additions, 513 Bessemer Road, and 966 Palisades, all within about seven miles — are treated as local. A sixth store, 107 in Sebring, Florida (about 520 miles away), is deliberately kept as a distant outlier: Nova treats it as not local, offering a transfer rather than a same-day hold. When an item is in stock at 1511, Nova gives its exact back-room location (zone, bay, shelf, bin, and reach height). When it is not at 1511 but a nearby store has it, she names the store and offers to hold a pair. A pre-computed stock summary and a firm rule prevent false out-of-stock calls: she never reports an item unavailable unless every size and store confirms it.</w:t>
       </w:r>
     </w:p>
     <w:p>
@@ -3125,7 +3311,7 @@
         <w:spacing w:after="120"/>
       </w:pPr>
       <w:r>
-        <w:t xml:space="preserve">She analyzes the image once with Claude’s vision, says what it is, and her description folds into the ongoing conversation as text, so follow-up questions (“what’s the model number?”) keep context without re-sending the image. Capture uses the system camera through an intent, so no camera permission is required. The image leaves the device only at the moment of analysis; because raw photos are far heavier than text memory, when off-device backup (D18) is built we will decide whether it carries the images or only Nova’s notes about them — encrypted client-side first (threat S13).</w:t>
+        <w:t xml:space="preserve">Outside demonstration mode she analyzes the image once with Claude’s vision, says what it is, and her description folds into the ongoing conversation as text, so follow-up questions (“what’s the model number?”) keep context without re-sending the image. In demonstration mode a photo is not an open-ended “describe this” but an item to match to inventory: a fast two-phase flow first identifies it in a single Sonnet vision pass (brand, model, colorway) and then runs a text-only inventory lookup, and she answers as a store associate would — always complimentary about the customer’s choice and never remarking on wear. Either way the photo becomes a turn in the live conversation, so the microphone reopens for John’s spoken reply and a picture can even be handed to her mid-conversation. Capture uses the system camera through an intent, so no camera permission is required. The image leaves the device only at the moment of analysis; because raw photos are far heavier than text memory, when off-device backup (D18) is built we will decide whether it carries the images or only Nova’s notes about them — encrypted client-side first (threat S13).</w:t>
       </w:r>
     </w:p>
     <w:p>
@@ -4714,7 +4900,7 @@
                 <w:b w:val="false"/>
                 <w:bCs w:val="false"/>
               </w:rPr>
-              <w:t xml:space="preserve">Web search (planned, D14) adds an API credential and egresses queries to the provider.</w:t>
+              <w:t xml:space="preserve">Web search (trialed via Anthropic’s server-side tool, D14) would egress queries to the provider; currently DISABLED.</w:t>
             </w:r>
           </w:p>
         </w:tc>
@@ -4754,7 +4940,7 @@
                 <w:b w:val="false"/>
                 <w:bCs w:val="false"/>
               </w:rPr>
-              <w:t xml:space="preserve">Store credential encrypted (S1); disclose in-app; treat fetched content as data, not instructions.</w:t>
+              <w:t xml:space="preserve">Uses Anthropic’s server-side web-search tool, so no separate credential is added. Trialed then disabled (HTTP 400s + added latency); the domain allow-list is retained in code but dormant. If re-enabled: disclose in-app and treat fetched content as data, not instructions.</w:t>
             </w:r>
           </w:p>
         </w:tc>
@@ -5747,7 +5933,7 @@
                 <w:b w:val="false"/>
                 <w:bCs w:val="false"/>
               </w:rPr>
-              <w:t xml:space="preserve">Planned — web search (D14), off-device backup (D18), streaming, push-to-talk.</w:t>
+              <w:t xml:space="preserve">Web search (D14) trialed then disabled (HTTP 400s + latency; dormant in code); off-device backup (D18), streaming, push-to-talk still planned.</w:t>
             </w:r>
           </w:p>
         </w:tc>

</xml_diff>